<commit_message>
Added another class involved in REQ4's sequence diagram
-Increased its complexity with one more class (which sends a message)
-Updated design rationale's sequence diagram accordingly
</commit_message>
<xml_diff>
--- a/docs/design/assignment2/REQ4/A2-REQ4-Rationale.docx
+++ b/docs/design/assignment2/REQ4/A2-REQ4-Rationale.docx
@@ -132,41 +132,34 @@
           <w:szCs w:val="28"/>
         </w:rPr>
       </w:pPr>
-    </w:p>
-    <w:p>
-      <w:pPr>
-        <w:rPr>
-          <w:sz w:val="28"/>
-          <w:szCs w:val="28"/>
-        </w:rPr>
-      </w:pPr>
       <w:r>
         <w:rPr>
           <w:noProof/>
           <w:sz w:val="28"/>
           <w:szCs w:val="28"/>
         </w:rPr>
+        <w:lastRenderedPageBreak/>
         <w:drawing>
-          <wp:anchor distT="0" distB="0" distL="114300" distR="114300" simplePos="0" relativeHeight="251659264" behindDoc="0" locked="0" layoutInCell="1" allowOverlap="1" wp14:anchorId="3FF60CD8" wp14:editId="17A4A719">
+          <wp:anchor distT="0" distB="0" distL="114300" distR="114300" simplePos="0" relativeHeight="251661312" behindDoc="0" locked="0" layoutInCell="1" allowOverlap="1" wp14:anchorId="6C68EA4F" wp14:editId="5FC71F8F">
             <wp:simplePos x="0" y="0"/>
             <wp:positionH relativeFrom="page">
               <wp:align>right</wp:align>
             </wp:positionH>
             <wp:positionV relativeFrom="paragraph">
-              <wp:posOffset>541020</wp:posOffset>
+              <wp:posOffset>294005</wp:posOffset>
             </wp:positionV>
-            <wp:extent cx="7764780" cy="6384925"/>
+            <wp:extent cx="7764780" cy="6099810"/>
             <wp:effectExtent l="0" t="0" r="7620" b="0"/>
             <wp:wrapThrough wrapText="bothSides">
               <wp:wrapPolygon edited="0">
                 <wp:start x="0" y="0"/>
-                <wp:lineTo x="0" y="21525"/>
-                <wp:lineTo x="21568" y="21525"/>
+                <wp:lineTo x="0" y="21519"/>
+                <wp:lineTo x="21568" y="21519"/>
                 <wp:lineTo x="21568" y="0"/>
                 <wp:lineTo x="0" y="0"/>
               </wp:wrapPolygon>
             </wp:wrapThrough>
-            <wp:docPr id="1706340575" name="Picture 1"/>
+            <wp:docPr id="29392698" name="Picture 1"/>
             <wp:cNvGraphicFramePr>
               <a:graphicFrameLocks xmlns:a="http://schemas.openxmlformats.org/drawingml/2006/main" noChangeAspect="1"/>
             </wp:cNvGraphicFramePr>
@@ -174,7 +167,7 @@
               <a:graphicData uri="http://schemas.openxmlformats.org/drawingml/2006/picture">
                 <pic:pic xmlns:pic="http://schemas.openxmlformats.org/drawingml/2006/picture">
                   <pic:nvPicPr>
-                    <pic:cNvPr id="1706340575" name="Picture 1706340575"/>
+                    <pic:cNvPr id="29392698" name="Picture 29392698"/>
                     <pic:cNvPicPr/>
                   </pic:nvPicPr>
                   <pic:blipFill>
@@ -192,7 +185,7 @@
                   <pic:spPr>
                     <a:xfrm>
                       <a:off x="0" y="0"/>
-                      <a:ext cx="7764780" cy="6384925"/>
+                      <a:ext cx="7764780" cy="6099810"/>
                     </a:xfrm>
                     <a:prstGeom prst="rect">
                       <a:avLst/>
@@ -217,6 +210,30 @@
         </w:rPr>
         <w:t>The UML sequence diagram for REQ4 is as follows:</w:t>
       </w:r>
+    </w:p>
+    <w:p>
+      <w:pPr>
+        <w:rPr>
+          <w:sz w:val="28"/>
+          <w:szCs w:val="28"/>
+        </w:rPr>
+      </w:pPr>
+    </w:p>
+    <w:p>
+      <w:pPr>
+        <w:rPr>
+          <w:sz w:val="28"/>
+          <w:szCs w:val="28"/>
+        </w:rPr>
+      </w:pPr>
+    </w:p>
+    <w:p>
+      <w:pPr>
+        <w:rPr>
+          <w:sz w:val="28"/>
+          <w:szCs w:val="28"/>
+        </w:rPr>
+      </w:pPr>
     </w:p>
     <w:p>
       <w:pPr>

</xml_diff>